<commit_message>
Actualizacion automatica -12-2025 09:09
</commit_message>
<xml_diff>
--- a/MAPPEAR.docx
+++ b/MAPPEAR.docx
@@ -9,6 +9,7 @@
           <w:szCs w:val="56"/>
         </w:rPr>
       </w:pPr>
+      <w:proofErr w:type="spellStart"/>
       <w:r>
         <w:rPr>
           <w:rFonts w:ascii="Calibri" w:hAnsi="Calibri" w:cs="Calibri"/>
@@ -34,15 +35,40 @@
         </w:rPr>
         <w:t>EAR</w:t>
       </w:r>
-    </w:p>
-    <w:p>
-      <w:r>
-        <w:t>Es una  herramienta de organización y programación de acciones, basada en establecimientos rurales georeferenciados de distintos partidos / Departamentos.</w:t>
-      </w:r>
-    </w:p>
-    <w:p>
-      <w:r>
-        <w:t xml:space="preserve">Las actividades se pueden  realizar en una tabla donde se listan los establecimientos con atributos como hectáreas y partido al cual pertenecen y cuatro casillas – </w:t>
+      <w:proofErr w:type="spellEnd"/>
+    </w:p>
+    <w:p>
+      <w:r>
+        <w:t xml:space="preserve">Es </w:t>
+      </w:r>
+      <w:proofErr w:type="gramStart"/>
+      <w:r>
+        <w:t>una  herramienta</w:t>
+      </w:r>
+      <w:proofErr w:type="gramEnd"/>
+      <w:r>
+        <w:t xml:space="preserve"> de organización y programación de acciones, basada en establecimientos rurales </w:t>
+      </w:r>
+      <w:proofErr w:type="spellStart"/>
+      <w:r>
+        <w:t>georeferenciados</w:t>
+      </w:r>
+      <w:proofErr w:type="spellEnd"/>
+      <w:r>
+        <w:t xml:space="preserve"> de distintos partidos / Departamentos.</w:t>
+      </w:r>
+    </w:p>
+    <w:p>
+      <w:r>
+        <w:t xml:space="preserve">Las actividades se </w:t>
+      </w:r>
+      <w:proofErr w:type="gramStart"/>
+      <w:r>
+        <w:t>pueden  realizar</w:t>
+      </w:r>
+      <w:proofErr w:type="gramEnd"/>
+      <w:r>
+        <w:t xml:space="preserve"> en una tabla donde se listan los establecimientos con atributos como hectáreas y partido al cual pertenecen y cuatro casillas – </w:t>
       </w:r>
       <w:r>
         <w:rPr>
@@ -61,7 +87,15 @@
         <w:t xml:space="preserve"> quien lo tiene alquilado/ categoría / </w:t>
       </w:r>
       <w:r>
-        <w:t xml:space="preserve"> etc)</w:t>
+        <w:t xml:space="preserve"> </w:t>
+      </w:r>
+      <w:proofErr w:type="spellStart"/>
+      <w:r>
+        <w:t>etc</w:t>
+      </w:r>
+      <w:proofErr w:type="spellEnd"/>
+      <w:r>
+        <w:t>)</w:t>
       </w:r>
     </w:p>
     <w:p>
@@ -87,7 +121,15 @@
     </w:p>
     <w:p>
       <w:r>
-        <w:t>En la pantalla se despliega una tabla flotante sobre un mapa. El mapa se puede ampliar o reducir con la rueda del mouse.</w:t>
+        <w:t xml:space="preserve">En la pantalla se despliega una tabla flotante sobre un mapa. El mapa se puede ampliar o reducir con la rueda del </w:t>
+      </w:r>
+      <w:proofErr w:type="gramStart"/>
+      <w:r>
+        <w:t>mouse</w:t>
+      </w:r>
+      <w:proofErr w:type="gramEnd"/>
+      <w:r>
+        <w:t>.</w:t>
       </w:r>
       <w:r>
         <w:t xml:space="preserve"> Para mover la tabla</w:t>
@@ -169,7 +211,15 @@
     </w:p>
     <w:p>
       <w:r>
-        <w:t xml:space="preserve">También se pueden hacer ediciones masivas seleccionando muchos registros y en el header de la tabla donde dice </w:t>
+        <w:t xml:space="preserve">También se pueden hacer ediciones masivas seleccionando muchos registros y en el </w:t>
+      </w:r>
+      <w:proofErr w:type="spellStart"/>
+      <w:r>
+        <w:t>header</w:t>
+      </w:r>
+      <w:proofErr w:type="spellEnd"/>
+      <w:r>
+        <w:t xml:space="preserve"> de la tabla donde dice </w:t>
       </w:r>
       <w:r>
         <w:rPr>
@@ -217,7 +267,15 @@
         <w:t>DESELECCIONAR</w:t>
       </w:r>
       <w:r>
-        <w:t xml:space="preserve"> los registros una vez editado de manera unitaria (haciendo clic en el establecimiento o destildando la casilla de verificación Sel) de manera total en el botón rojo </w:t>
+        <w:t xml:space="preserve"> los registros una vez editado de manera unitaria (haciendo clic en el establecimiento o </w:t>
+      </w:r>
+      <w:proofErr w:type="spellStart"/>
+      <w:r>
+        <w:t>destildando</w:t>
+      </w:r>
+      <w:proofErr w:type="spellEnd"/>
+      <w:r>
+        <w:t xml:space="preserve"> la casilla de verificación Sel) de manera total en el botón rojo </w:t>
       </w:r>
       <w:r>
         <w:rPr>
@@ -243,7 +301,15 @@
         <w:t>FILTAR ATRIBUTOS</w:t>
       </w:r>
       <w:r>
-        <w:t xml:space="preserve"> se pueden completar las casillas de filtrado de forma parcial de modo que el programa filtra los registros según ese criterio. Ej si ponemos JOSE en la casilla de </w:t>
+        <w:t xml:space="preserve"> se pueden completar las casillas de filtrado de forma parcial de modo que el programa filtra los registros según ese criterio. </w:t>
+      </w:r>
+      <w:proofErr w:type="spellStart"/>
+      <w:r>
+        <w:t>Ej</w:t>
+      </w:r>
+      <w:proofErr w:type="spellEnd"/>
+      <w:r>
+        <w:t xml:space="preserve"> si ponemos JOSE en la casilla de </w:t>
       </w:r>
       <w:r>
         <w:rPr>
@@ -308,18 +374,39 @@
         <w:t>EDICIONES MASIVAS</w:t>
       </w:r>
       <w:r>
-        <w:t xml:space="preserve"> son una buena herramienta para editar muchos registros a  la vez.</w:t>
-      </w:r>
-    </w:p>
-    <w:p>
-      <w:pPr>
-        <w:rPr>
-          <w:b/>
-          <w:bCs/>
-        </w:rPr>
-      </w:pPr>
-      <w:r>
-        <w:t xml:space="preserve">MAppEAR permite imprimir reportes en .pdf de los registros seleccionado al hacer clic en el botón inferior </w:t>
+        <w:t xml:space="preserve"> son una buena herramienta para editar muchos registros </w:t>
+      </w:r>
+      <w:proofErr w:type="gramStart"/>
+      <w:r>
+        <w:t>a  la</w:t>
+      </w:r>
+      <w:proofErr w:type="gramEnd"/>
+      <w:r>
+        <w:t xml:space="preserve"> vez.</w:t>
+      </w:r>
+    </w:p>
+    <w:p>
+      <w:pPr>
+        <w:rPr>
+          <w:b/>
+          <w:bCs/>
+        </w:rPr>
+      </w:pPr>
+      <w:proofErr w:type="spellStart"/>
+      <w:r>
+        <w:t>MAppEAR</w:t>
+      </w:r>
+      <w:proofErr w:type="spellEnd"/>
+      <w:r>
+        <w:t xml:space="preserve"> permite imprimir reportes en .</w:t>
+      </w:r>
+      <w:proofErr w:type="spellStart"/>
+      <w:r>
+        <w:t>pdf</w:t>
+      </w:r>
+      <w:proofErr w:type="spellEnd"/>
+      <w:r>
+        <w:t xml:space="preserve"> de los registros seleccionado al hacer clic en el botón inferior </w:t>
       </w:r>
       <w:r>
         <w:rPr>
@@ -338,7 +425,15 @@
     </w:p>
     <w:p>
       <w:r>
-        <w:t>Para grabar presionar en el botón azul inferior GUARDAR, y dá dos opciones:</w:t>
+        <w:t xml:space="preserve">Para grabar presionar en el botón azul inferior GUARDAR, y </w:t>
+      </w:r>
+      <w:proofErr w:type="spellStart"/>
+      <w:r>
+        <w:t>dá</w:t>
+      </w:r>
+      <w:proofErr w:type="spellEnd"/>
+      <w:r>
+        <w:t xml:space="preserve"> dos opciones:</w:t>
       </w:r>
     </w:p>
     <w:p>
@@ -357,7 +452,15 @@
         <w:t>GUARDAR</w:t>
       </w:r>
       <w:r>
-        <w:t xml:space="preserve"> y guarda el mismo archivo que se abrío </w:t>
+        <w:t xml:space="preserve"> y guarda el mismo archivo que se </w:t>
+      </w:r>
+      <w:proofErr w:type="spellStart"/>
+      <w:r>
+        <w:t>abrío</w:t>
+      </w:r>
+      <w:proofErr w:type="spellEnd"/>
+      <w:r>
+        <w:t xml:space="preserve"> </w:t>
       </w:r>
     </w:p>
     <w:p>
@@ -397,6 +500,24 @@
     <w:p>
       <w:r>
         <w:t>Haciendo clic sobre el Titulo de la columna, ordena de manera creciente o decreciente los registros seleccionados. De esta manera las columnas que tienen palabras las ordena de A-&gt; Z en el primer clic y de Z-&gt;A en el segundo. Y de mayor a menor y viceversa en las columnas numéricas – como Has -.</w:t>
+      </w:r>
+    </w:p>
+    <w:p>
+      <w:r>
+        <w:t>Seleccionando registros puedes variar la OPACIDAD/ TRANSPARENCIA del color de los registros seleccionados, con el control deslizante.</w:t>
+      </w:r>
+    </w:p>
+    <w:p>
+      <w:r>
+        <w:t xml:space="preserve">Con el botón inferior izquierdo puede </w:t>
+      </w:r>
+      <w:proofErr w:type="gramStart"/>
+      <w:r>
+        <w:t>optar  por</w:t>
+      </w:r>
+      <w:proofErr w:type="gramEnd"/>
+      <w:r>
+        <w:t xml:space="preserve"> la capa de base del mapa : OPEN STREET MAP / SATELITAL / TIFF PERSONALIZADA</w:t>
       </w:r>
     </w:p>
     <w:p/>

</xml_diff>

<commit_message>
Actualizacion automatica -12-2025 08:57
</commit_message>
<xml_diff>
--- a/MAPPEAR.docx
+++ b/MAPPEAR.docx
@@ -521,7 +521,144 @@
       </w:r>
     </w:p>
     <w:p/>
-    <w:p/>
+    <w:p>
+      <w:r>
+        <w:t>UTILIDADES</w:t>
+      </w:r>
+    </w:p>
+    <w:p>
+      <w:pPr>
+        <w:pStyle w:val="Prrafodelista"/>
+        <w:numPr>
+          <w:ilvl w:val="0"/>
+          <w:numId w:val="1"/>
+        </w:numPr>
+      </w:pPr>
+      <w:r>
+        <w:t>Productores propios</w:t>
+      </w:r>
+    </w:p>
+    <w:p>
+      <w:pPr>
+        <w:pStyle w:val="Prrafodelista"/>
+        <w:numPr>
+          <w:ilvl w:val="0"/>
+          <w:numId w:val="1"/>
+        </w:numPr>
+      </w:pPr>
+      <w:r>
+        <w:t xml:space="preserve">Productores que compran a otros </w:t>
+      </w:r>
+    </w:p>
+    <w:p>
+      <w:pPr>
+        <w:pStyle w:val="Prrafodelista"/>
+        <w:numPr>
+          <w:ilvl w:val="0"/>
+          <w:numId w:val="1"/>
+        </w:numPr>
+      </w:pPr>
+      <w:r>
+        <w:t>Productores que no nos compran</w:t>
+      </w:r>
+    </w:p>
+    <w:p>
+      <w:pPr>
+        <w:pStyle w:val="Prrafodelista"/>
+        <w:numPr>
+          <w:ilvl w:val="0"/>
+          <w:numId w:val="1"/>
+        </w:numPr>
+      </w:pPr>
+      <w:r>
+        <w:t>Productores de cierto rango de has</w:t>
+      </w:r>
+    </w:p>
+    <w:p>
+      <w:pPr>
+        <w:pStyle w:val="Prrafodelista"/>
+        <w:numPr>
+          <w:ilvl w:val="0"/>
+          <w:numId w:val="1"/>
+        </w:numPr>
+      </w:pPr>
+      <w:r>
+        <w:t>Productores que no nos compran cierto producto</w:t>
+      </w:r>
+    </w:p>
+    <w:p>
+      <w:pPr>
+        <w:pStyle w:val="Prrafodelista"/>
+        <w:numPr>
+          <w:ilvl w:val="0"/>
+          <w:numId w:val="1"/>
+        </w:numPr>
+      </w:pPr>
+      <w:r>
+        <w:t>Productores objetivo para acción de MKT</w:t>
+      </w:r>
+    </w:p>
+    <w:p>
+      <w:pPr>
+        <w:pStyle w:val="Prrafodelista"/>
+        <w:numPr>
+          <w:ilvl w:val="0"/>
+          <w:numId w:val="1"/>
+        </w:numPr>
+      </w:pPr>
+      <w:r>
+        <w:t>Campos en alquiler</w:t>
+      </w:r>
+      <w:r>
+        <w:t xml:space="preserve"> </w:t>
+      </w:r>
+    </w:p>
+    <w:p>
+      <w:pPr>
+        <w:pStyle w:val="Prrafodelista"/>
+        <w:numPr>
+          <w:ilvl w:val="0"/>
+          <w:numId w:val="1"/>
+        </w:numPr>
+      </w:pPr>
+      <w:r>
+        <w:t>Campos con MANI</w:t>
+      </w:r>
+    </w:p>
+    <w:p>
+      <w:pPr>
+        <w:pStyle w:val="Prrafodelista"/>
+        <w:numPr>
+          <w:ilvl w:val="0"/>
+          <w:numId w:val="1"/>
+        </w:numPr>
+      </w:pPr>
+      <w:r>
+        <w:t>Campos siembra propia</w:t>
+      </w:r>
+    </w:p>
+    <w:p>
+      <w:pPr>
+        <w:pStyle w:val="Prrafodelista"/>
+        <w:numPr>
+          <w:ilvl w:val="0"/>
+          <w:numId w:val="1"/>
+        </w:numPr>
+      </w:pPr>
+      <w:r>
+        <w:lastRenderedPageBreak/>
+        <w:t>Campos siembra competencia</w:t>
+      </w:r>
+    </w:p>
+    <w:p>
+      <w:pPr>
+        <w:pStyle w:val="Prrafodelista"/>
+        <w:numPr>
+          <w:ilvl w:val="0"/>
+          <w:numId w:val="1"/>
+        </w:numPr>
+      </w:pPr>
+    </w:p>
     <w:p/>
     <w:p/>
     <w:p/>

</xml_diff>

<commit_message>
Actualizacion automatica -12-2025 16:04
</commit_message>
<xml_diff>
--- a/MAPPEAR.docx
+++ b/MAPPEAR.docx
@@ -549,6 +549,9 @@
       <w:r>
         <w:t xml:space="preserve">Productores que compran a otros </w:t>
       </w:r>
+      <w:r>
+        <w:t>BAYER</w:t>
+      </w:r>
     </w:p>
     <w:p>
       <w:pPr>
@@ -623,6 +626,9 @@
       </w:pPr>
       <w:r>
         <w:t>Campos con MANI</w:t>
+      </w:r>
+      <w:r>
+        <w:t xml:space="preserve"> / GIRASOL</w:t>
       </w:r>
     </w:p>
     <w:p>

</xml_diff>

<commit_message>
Actualizacion automatica -01-2026 19:30
</commit_message>
<xml_diff>
--- a/MAPPEAR.docx
+++ b/MAPPEAR.docx
@@ -9,7 +9,6 @@
           <w:szCs w:val="56"/>
         </w:rPr>
       </w:pPr>
-      <w:proofErr w:type="spellStart"/>
       <w:r>
         <w:rPr>
           <w:rFonts w:ascii="Calibri" w:hAnsi="Calibri" w:cs="Calibri"/>
@@ -35,40 +34,24 @@
         </w:rPr>
         <w:t>EAR</w:t>
       </w:r>
-      <w:proofErr w:type="spellEnd"/>
-    </w:p>
-    <w:p>
-      <w:r>
-        <w:t xml:space="preserve">Es </w:t>
-      </w:r>
-      <w:proofErr w:type="gramStart"/>
-      <w:r>
-        <w:t>una  herramienta</w:t>
-      </w:r>
-      <w:proofErr w:type="gramEnd"/>
-      <w:r>
-        <w:t xml:space="preserve"> de organización y programación de acciones, basada en establecimientos rurales </w:t>
-      </w:r>
-      <w:proofErr w:type="spellStart"/>
-      <w:r>
-        <w:t>georeferenciados</w:t>
-      </w:r>
-      <w:proofErr w:type="spellEnd"/>
-      <w:r>
-        <w:t xml:space="preserve"> de distintos partidos / Departamentos.</w:t>
-      </w:r>
-    </w:p>
-    <w:p>
-      <w:r>
-        <w:t xml:space="preserve">Las actividades se </w:t>
-      </w:r>
-      <w:proofErr w:type="gramStart"/>
-      <w:r>
-        <w:t>pueden  realizar</w:t>
-      </w:r>
-      <w:proofErr w:type="gramEnd"/>
-      <w:r>
-        <w:t xml:space="preserve"> en una tabla donde se listan los establecimientos con atributos como hectáreas y partido al cual pertenecen y cuatro casillas – </w:t>
+    </w:p>
+    <w:p>
+      <w:pPr>
+        <w:ind w:firstLine="708"/>
+      </w:pPr>
+      <w:r>
+        <w:t>Es una herramienta de organización y programación de acciones, basada en establecimientos rurales georeferenciados de distintos partidos / Departamentos.</w:t>
+      </w:r>
+    </w:p>
+    <w:p>
+      <w:r>
+        <w:t>Las actividades se pueden realizar en una tabla</w:t>
+      </w:r>
+      <w:r>
+        <w:t xml:space="preserve"> flotante sobre un mapa, </w:t>
+      </w:r>
+      <w:r>
+        <w:t xml:space="preserve">donde se listan los establecimientos con atributos como hectáreas y partido al cual pertenecen y cuatro casillas – </w:t>
       </w:r>
       <w:r>
         <w:rPr>
@@ -78,7 +61,7 @@
         <w:t>STATUS</w:t>
       </w:r>
       <w:r>
-        <w:t xml:space="preserve"> – donde el  usuario puede editarlas para clasificar cada establecimiento según distintos atributos ( Cliente / no cliente / perteneciente a cierto grupo/ comprador o no de  cierto producto / </w:t>
+        <w:t xml:space="preserve"> – donde el usuario puede editarlas para clasificar cada establecimiento según distintos atributos ( Cliente / no cliente / perteneciente a cierto grupo/ comprador o no de  cierto producto / </w:t>
       </w:r>
       <w:r>
         <w:t>prospecto / dueño / usuario / nombre del establecimiento /</w:t>
@@ -87,23 +70,77 @@
         <w:t xml:space="preserve"> quien lo tiene alquilado/ categoría / </w:t>
       </w:r>
       <w:r>
+        <w:t xml:space="preserve"> etc)</w:t>
+      </w:r>
+    </w:p>
+    <w:p>
+      <w:r>
+        <w:t>Esta tabla permite listar / filtrar / editar los registros de manera de visualizarlos con colores, contabilizarlos, individualizarlos geográficamente, imprimirlos según los atributos deseados.</w:t>
+      </w:r>
+    </w:p>
+    <w:p>
+      <w:r>
+        <w:t>El complemento de la</w:t>
+      </w:r>
+      <w:r>
+        <w:rPr>
+          <w:b/>
+          <w:bCs/>
+        </w:rPr>
         <w:t xml:space="preserve"> </w:t>
       </w:r>
-      <w:proofErr w:type="spellStart"/>
-      <w:r>
-        <w:t>etc</w:t>
-      </w:r>
-      <w:proofErr w:type="spellEnd"/>
-      <w:r>
-        <w:t>)</w:t>
-      </w:r>
-    </w:p>
-    <w:p>
-      <w:r>
-        <w:t>Esta tabla permite listar / filtrar / editar los registros de manera de visualizarlos con colores, contabilizarlos, individualizarlos geográficamente, imprimirlos según los atributos deseados.</w:t>
+      <w:r>
+        <w:rPr>
+          <w:b/>
+          <w:bCs/>
+        </w:rPr>
+        <w:t>TABLA</w:t>
+      </w:r>
+      <w:r>
+        <w:t>,</w:t>
+      </w:r>
+      <w:r>
+        <w:t xml:space="preserve"> es el </w:t>
+      </w:r>
+      <w:r>
+        <w:rPr>
+          <w:b/>
+          <w:bCs/>
+        </w:rPr>
+        <w:t>MAPA</w:t>
+      </w:r>
+      <w:r>
+        <w:t>,</w:t>
+      </w:r>
+      <w:r>
+        <w:t xml:space="preserve"> donde los polígonos georeferenciados están linkeados directamente con </w:t>
+      </w:r>
+      <w:r>
+        <w:t>los campos de la tabla y cualquier modificación que se realice en uno de ellos se traduce en cambios en el otro.</w:t>
+      </w:r>
+    </w:p>
+    <w:p>
+      <w:r>
+        <w:t xml:space="preserve"> El mapa se puede ampliar o reducir con la rueda del mouse. Para mover la tabla, “tomarla” con el mouse de la banda azul superior que dice </w:t>
+      </w:r>
+      <w:r>
+        <w:rPr>
+          <w:b/>
+          <w:bCs/>
+        </w:rPr>
+        <w:t>FILTRAR ATRIBUTOS</w:t>
+      </w:r>
+      <w:r>
+        <w:t xml:space="preserve"> y moverla a gusto.</w:t>
+      </w:r>
+    </w:p>
+    <w:p>
+      <w:r>
+        <w:t xml:space="preserve">Al pasar el puntero sobre el mapa, sobre éste se despliega un cartel con información como el dueño y la superficie catastral. </w:t>
       </w:r>
     </w:p>
     <w:p/>
+    <w:p/>
     <w:p>
       <w:pPr>
         <w:rPr>
@@ -121,319 +158,98 @@
     </w:p>
     <w:p>
       <w:r>
-        <w:t xml:space="preserve">En la pantalla se despliega una tabla flotante sobre un mapa. El mapa se puede ampliar o reducir con la rueda del </w:t>
-      </w:r>
-      <w:proofErr w:type="gramStart"/>
-      <w:r>
-        <w:t>mouse</w:t>
-      </w:r>
-      <w:proofErr w:type="gramEnd"/>
-      <w:r>
-        <w:t>.</w:t>
-      </w:r>
-      <w:r>
-        <w:t xml:space="preserve"> Para mover la tabla</w:t>
-      </w:r>
-      <w:r>
-        <w:t>,</w:t>
-      </w:r>
-      <w:r>
-        <w:t xml:space="preserve"> “tomarla” con el mouse de la banda azul superior que dice </w:t>
-      </w:r>
-      <w:r>
-        <w:rPr>
-          <w:b/>
-          <w:bCs/>
-        </w:rPr>
-        <w:t>FILTRAR ATRIBUTOS</w:t>
-      </w:r>
-      <w:r>
-        <w:t xml:space="preserve"> y moverla a gusto.</w:t>
-      </w:r>
-    </w:p>
-    <w:p>
-      <w:r>
-        <w:t xml:space="preserve"> Al hacer clic </w:t>
-      </w:r>
-      <w:r>
-        <w:t>en</w:t>
-      </w:r>
-      <w:r>
-        <w:t xml:space="preserve"> un establecimiento</w:t>
-      </w:r>
-      <w:r>
-        <w:t xml:space="preserve"> en el mapa</w:t>
-      </w:r>
-      <w:r>
-        <w:t xml:space="preserve">, sobre éste se despliega un cartel con </w:t>
-      </w:r>
-      <w:r>
-        <w:t>información como</w:t>
-      </w:r>
-      <w:r>
-        <w:t xml:space="preserve"> el dueño y la superficie catastral. También queda seleccionado para poder editarlo en CUALQUIERA de los campos que lo componen. Esto se puede ver en la tabla</w:t>
-      </w:r>
-      <w:r>
-        <w:t>,</w:t>
-      </w:r>
-      <w:r>
-        <w:t xml:space="preserve"> donde este registro queda de color amarillo, con la casilla de verificación de selección tildada. Un segundo clic sobre el mismo</w:t>
-      </w:r>
-      <w:r>
-        <w:t>,</w:t>
-      </w:r>
-      <w:r>
-        <w:t xml:space="preserve"> lo deselecciona.</w:t>
-      </w:r>
-      <w:r>
-        <w:t xml:space="preserve"> </w:t>
-      </w:r>
-    </w:p>
-    <w:p>
-      <w:r>
-        <w:rPr>
-          <w:b/>
-          <w:bCs/>
-        </w:rPr>
-        <w:t>EDICION DE REGISTROS</w:t>
-      </w:r>
-    </w:p>
-    <w:p>
-      <w:r>
-        <w:t>En la tabla se pueden editar todos los atributos del registro seleccionado</w:t>
-      </w:r>
-      <w:r>
-        <w:t xml:space="preserve"> o no seleccionado</w:t>
-      </w:r>
-      <w:r>
-        <w:t>, simplemente sobrescribiendo la casilla deseada.</w:t>
-      </w:r>
-    </w:p>
-    <w:p>
-      <w:r>
-        <w:t xml:space="preserve">También se pueden hacer ediciones masivas seleccionando muchos registros y en el </w:t>
-      </w:r>
-      <w:proofErr w:type="spellStart"/>
-      <w:r>
-        <w:t>header</w:t>
-      </w:r>
-      <w:proofErr w:type="spellEnd"/>
-      <w:r>
-        <w:t xml:space="preserve"> de la tabla donde dice </w:t>
-      </w:r>
-      <w:r>
-        <w:rPr>
-          <w:b/>
-          <w:bCs/>
-        </w:rPr>
-        <w:t>EDICIONES MASIVAS</w:t>
-      </w:r>
-      <w:r>
-        <w:t xml:space="preserve">, se cambian los atributos que al hacer clic en </w:t>
-      </w:r>
-      <w:r>
-        <w:rPr>
-          <w:b/>
-          <w:bCs/>
-        </w:rPr>
-        <w:t>EDITAR COLUMNAS</w:t>
-      </w:r>
-      <w:r>
-        <w:t xml:space="preserve"> se copian a los registros seleccionados.</w:t>
-      </w:r>
-      <w:r>
-        <w:t xml:space="preserve"> Si se quiere cambiar el color, se debe hacer clic en </w:t>
-      </w:r>
-      <w:r>
-        <w:rPr>
-          <w:b/>
-          <w:bCs/>
-        </w:rPr>
-        <w:t>APLICAR</w:t>
-      </w:r>
-      <w:r>
-        <w:t xml:space="preserve"> para que los cambios tengan efecto.</w:t>
-      </w:r>
-    </w:p>
-    <w:p>
-      <w:r>
-        <w:t xml:space="preserve">Siempre es conveniente </w:t>
-      </w:r>
-      <w:r>
-        <w:rPr>
-          <w:b/>
-          <w:bCs/>
-        </w:rPr>
-        <w:t>DESELECCIONAR</w:t>
-      </w:r>
-      <w:r>
-        <w:t xml:space="preserve"> los registros una vez editado de manera unitaria (haciendo clic en el establecimiento o </w:t>
-      </w:r>
-      <w:proofErr w:type="spellStart"/>
-      <w:r>
-        <w:t>destildando</w:t>
-      </w:r>
-      <w:proofErr w:type="spellEnd"/>
-      <w:r>
-        <w:t xml:space="preserve"> la casilla de verificación Sel) de manera total en el botón rojo </w:t>
-      </w:r>
-      <w:r>
-        <w:rPr>
-          <w:b/>
-          <w:bCs/>
-        </w:rPr>
-        <w:t>DESELECCIONAR</w:t>
-      </w:r>
-      <w:r>
-        <w:t>.</w:t>
-      </w:r>
-    </w:p>
-    <w:p>
-      <w:r>
+        <w:rPr>
+          <w:b/>
+          <w:bCs/>
+        </w:rPr>
+        <w:t>SELECCIÓN DE CAMPOS</w:t>
+      </w:r>
+      <w:r>
+        <w:t xml:space="preserve">   Haciendo click en cada polígono con el botón IZQUIERDO del mouse</w:t>
+      </w:r>
+      <w:r>
+        <w:t xml:space="preserve"> en el mapa,</w:t>
+      </w:r>
+      <w:r>
+        <w:t xml:space="preserve"> se selecciona un polígono por vez, o presionando el DERECHO del mouse y deslizando el cursor sobre los polígonos, se van seleccionando todos los polígonos iluminados por el cursor.</w:t>
+      </w:r>
+      <w:r>
+        <w:t xml:space="preserve"> En todos los casos, los campos seleccionados se iluminan en amarillo en la tabla y son plausibles para hacer ediciones unitarias o masivas.</w:t>
+      </w:r>
+      <w:r>
+        <w:t xml:space="preserve"> Repitiendo la acción sobre el polígono este / estos se deseleccionan. </w:t>
+      </w:r>
+    </w:p>
+    <w:p>
+      <w:r>
+        <w:rPr>
+          <w:b/>
+          <w:bCs/>
+        </w:rPr>
+        <w:t>ORDENAMIENTO DE CAMPOS</w:t>
+      </w:r>
+      <w:r>
+        <w:t xml:space="preserve"> Haciendo click en el título de la columna, ordena los campos seleccionados de menor a mayor o alfabéticamente y viceversa con el segundo click.</w:t>
+      </w:r>
+    </w:p>
+    <w:p>
+      <w:r>
+        <w:rPr>
+          <w:b/>
+          <w:bCs/>
+        </w:rPr>
         <w:lastRenderedPageBreak/>
-        <w:t xml:space="preserve">En la sección </w:t>
-      </w:r>
-      <w:r>
-        <w:rPr>
-          <w:b/>
-          <w:bCs/>
-        </w:rPr>
-        <w:t>FILTAR ATRIBUTOS</w:t>
-      </w:r>
-      <w:r>
-        <w:t xml:space="preserve"> se pueden completar las casillas de filtrado de forma parcial de modo que el programa filtra los registros según ese criterio. </w:t>
-      </w:r>
-      <w:proofErr w:type="spellStart"/>
-      <w:r>
-        <w:t>Ej</w:t>
-      </w:r>
-      <w:proofErr w:type="spellEnd"/>
-      <w:r>
-        <w:t xml:space="preserve"> si ponemos JOSE en la casilla de </w:t>
-      </w:r>
-      <w:r>
-        <w:rPr>
-          <w:b/>
-          <w:bCs/>
-        </w:rPr>
-        <w:t>NOMBRE</w:t>
-      </w:r>
-      <w:r>
-        <w:t xml:space="preserve">, se seleccionan todos los registros que tengan el nombre JOSÉ. Si se seleccionan con el botón verde </w:t>
-      </w:r>
-      <w:r>
-        <w:rPr>
-          <w:b/>
-          <w:bCs/>
-        </w:rPr>
-        <w:t>SELECCIONAR</w:t>
-      </w:r>
-      <w:r>
-        <w:t>, todos los registros quedarán para ser editados</w:t>
-      </w:r>
-      <w:r>
-        <w:t xml:space="preserve"> de manera masiva. </w:t>
-      </w:r>
-    </w:p>
-    <w:p>
-      <w:r>
-        <w:t>El filtrado se puede hacer también teniendo en cuenta el criterio de color.</w:t>
-      </w:r>
-    </w:p>
-    <w:p>
-      <w:r>
-        <w:t xml:space="preserve">Para editar los registros por color primero se seleccionan, y luego se edita el color del bloque entre las distintas alternativas y luego clic en </w:t>
-      </w:r>
-      <w:r>
-        <w:rPr>
-          <w:b/>
-          <w:bCs/>
-        </w:rPr>
-        <w:t>Aplicar.</w:t>
-      </w:r>
-      <w:r>
-        <w:rPr>
-          <w:b/>
-          <w:bCs/>
-        </w:rPr>
-        <w:t xml:space="preserve"> S</w:t>
-      </w:r>
-      <w:r>
-        <w:t>iempre deseleccionar luego de editar.</w:t>
-      </w:r>
-    </w:p>
-    <w:p>
-      <w:r>
-        <w:t xml:space="preserve">Las </w:t>
-      </w:r>
-      <w:r>
-        <w:rPr>
-          <w:b/>
-          <w:bCs/>
-        </w:rPr>
-        <w:t>EDICIONES MASIVAS</w:t>
-      </w:r>
-      <w:r>
-        <w:t xml:space="preserve"> son una buena herramienta para editar muchos registros </w:t>
-      </w:r>
-      <w:proofErr w:type="gramStart"/>
-      <w:r>
-        <w:t>a  la</w:t>
-      </w:r>
-      <w:proofErr w:type="gramEnd"/>
-      <w:r>
-        <w:t xml:space="preserve"> vez.</w:t>
-      </w:r>
-    </w:p>
-    <w:p>
-      <w:pPr>
-        <w:rPr>
-          <w:b/>
-          <w:bCs/>
-        </w:rPr>
-      </w:pPr>
-      <w:proofErr w:type="spellStart"/>
-      <w:r>
-        <w:t>MAppEAR</w:t>
-      </w:r>
-      <w:proofErr w:type="spellEnd"/>
-      <w:r>
-        <w:t xml:space="preserve"> permite imprimir reportes en .</w:t>
-      </w:r>
-      <w:proofErr w:type="spellStart"/>
-      <w:r>
-        <w:t>pdf</w:t>
-      </w:r>
-      <w:proofErr w:type="spellEnd"/>
-      <w:r>
-        <w:t xml:space="preserve"> de los registros seleccionado al hacer clic en el botón inferior </w:t>
-      </w:r>
-      <w:r>
-        <w:rPr>
-          <w:b/>
-          <w:bCs/>
-        </w:rPr>
-        <w:t>EXPORTAR PDF.</w:t>
-      </w:r>
-      <w:r>
-        <w:rPr>
-          <w:b/>
-          <w:bCs/>
-        </w:rPr>
-        <w:t xml:space="preserve"> </w:t>
-      </w:r>
-    </w:p>
-    <w:p>
-      <w:r>
-        <w:t xml:space="preserve">Para grabar presionar en el botón azul inferior GUARDAR, y </w:t>
-      </w:r>
-      <w:proofErr w:type="spellStart"/>
-      <w:r>
-        <w:t>dá</w:t>
-      </w:r>
-      <w:proofErr w:type="spellEnd"/>
-      <w:r>
-        <w:t xml:space="preserve"> dos opciones:</w:t>
+        <w:t>EDITAR CAMPO SELECCIONADO</w:t>
+      </w:r>
+      <w:r>
+        <w:t>.  Se puede cambiar el NOMBRE / SUP / Cualquiera de los tres Status en la tabla o el color de relleno en el apartado FILTRAR ATRIBUTOS</w:t>
+      </w:r>
+    </w:p>
+    <w:p>
+      <w:r>
+        <w:rPr>
+          <w:b/>
+          <w:bCs/>
+        </w:rPr>
+        <w:t>FILTRO DE CAMPOS</w:t>
+      </w:r>
+      <w:r>
+        <w:t xml:space="preserve">   En el apartado FILTRAR ATRIBUTOS se puede filtrar </w:t>
+      </w:r>
+      <w:r>
+        <w:t>por cualquiera de los atributos de las columnas los campos que coincida total o parcialmente con lo llenado en la/ las columnas de este apartado, incluido el COLOR de los polígonos.</w:t>
+      </w:r>
+      <w:r>
+        <w:t xml:space="preserve">  El botón LIMPIAR (Amarillo) borra todos los parámetros de filtro y lleva la tabla a su estado original sin filtros.</w:t>
+      </w:r>
+    </w:p>
+    <w:p>
+      <w:r>
+        <w:t xml:space="preserve">Estos campos se pueden seleccionar con el botón verde Seleccionar, para editar uno o varios atributos de los campos. Si que quiere editar de a uno por vez se completa los datos en la casilla del campo seleccionado en la tabla, pero si se quiere hacer EDICIONES MASIVAS se puede ir a este apartado y completando las casillas y luego haciendo ckick en EDITAR COLUMNAS, se completará con estos datos todos los campos seleccionados. </w:t>
+      </w:r>
+    </w:p>
+    <w:p>
+      <w:r>
+        <w:rPr>
+          <w:b/>
+          <w:bCs/>
+        </w:rPr>
+        <w:t xml:space="preserve">CAMBIAR TRANSPARENCIA/OPACIDAD </w:t>
+      </w:r>
+      <w:r>
+        <w:t>se puede modificar la transparencia del color de los lotes seleccionados con el control deslizante OPACIDAD.</w:t>
+      </w:r>
+    </w:p>
+    <w:p>
+      <w:r>
+        <w:rPr>
+          <w:b/>
+          <w:bCs/>
+        </w:rPr>
+        <w:t>GUARDAR</w:t>
+      </w:r>
+      <w:r>
+        <w:t xml:space="preserve"> Bajo este botón tenemos tres opciones:</w:t>
       </w:r>
     </w:p>
     <w:p>
@@ -445,22 +261,7 @@
         </w:numPr>
       </w:pPr>
       <w:r>
-        <w:rPr>
-          <w:b/>
-          <w:bCs/>
-        </w:rPr>
-        <w:t>GUARDAR</w:t>
-      </w:r>
-      <w:r>
-        <w:t xml:space="preserve"> y guarda el mismo archivo que se </w:t>
-      </w:r>
-      <w:proofErr w:type="spellStart"/>
-      <w:r>
-        <w:t>abrío</w:t>
-      </w:r>
-      <w:proofErr w:type="spellEnd"/>
-      <w:r>
-        <w:t xml:space="preserve"> </w:t>
+        <w:t>GUARDAR COMO al presionar se puede guardar el archivo como un archivo nuevo con otro nombre a designar.  Si uno quiere seguir operando este archivo nuevo debe salir y seleccionarlo para entrar y operarlo</w:t>
       </w:r>
     </w:p>
     <w:p>
@@ -472,58 +273,7 @@
         </w:numPr>
       </w:pPr>
       <w:r>
-        <w:rPr>
-          <w:b/>
-          <w:bCs/>
-        </w:rPr>
-        <w:t>GUARDAR COMO</w:t>
-      </w:r>
-      <w:r>
-        <w:t xml:space="preserve"> y guarda un nuevo archivo con nombre a elegir con los cambios hechos.  Esta acción no modifica el archivo original que continúa con el mismo nombre.</w:t>
-      </w:r>
-    </w:p>
-    <w:p>
-      <w:r>
-        <w:t xml:space="preserve">Cliqueando en el botón ocre </w:t>
-      </w:r>
-      <w:r>
-        <w:rPr>
-          <w:b/>
-          <w:bCs/>
-        </w:rPr>
-        <w:t>LIMPIAR</w:t>
-      </w:r>
-      <w:r>
-        <w:t>, borra todos los filtros y restablece a cero los filtros y ediciones</w:t>
-      </w:r>
-    </w:p>
-    <w:p>
-      <w:r>
-        <w:t>Haciendo clic sobre el Titulo de la columna, ordena de manera creciente o decreciente los registros seleccionados. De esta manera las columnas que tienen palabras las ordena de A-&gt; Z en el primer clic y de Z-&gt;A en el segundo. Y de mayor a menor y viceversa en las columnas numéricas – como Has -.</w:t>
-      </w:r>
-    </w:p>
-    <w:p>
-      <w:r>
-        <w:t>Seleccionando registros puedes variar la OPACIDAD/ TRANSPARENCIA del color de los registros seleccionados, con el control deslizante.</w:t>
-      </w:r>
-    </w:p>
-    <w:p>
-      <w:r>
-        <w:t xml:space="preserve">Con el botón inferior izquierdo puede </w:t>
-      </w:r>
-      <w:proofErr w:type="gramStart"/>
-      <w:r>
-        <w:t>optar  por</w:t>
-      </w:r>
-      <w:proofErr w:type="gramEnd"/>
-      <w:r>
-        <w:t xml:space="preserve"> la capa de base del mapa : OPEN STREET MAP / SATELITAL / TIFF PERSONALIZADA</w:t>
-      </w:r>
-    </w:p>
-    <w:p/>
-    <w:p>
-      <w:r>
-        <w:t>UTILIDADES</w:t>
+        <w:t>GUARDAR ARCHIVOS ABIERTOS lo que hace es guarda el o los archivos abiertos en este momento. Uno tiene la posibilidad de guardar los archivos deseados y seleccionados</w:t>
       </w:r>
     </w:p>
     <w:p>
@@ -535,7 +285,55 @@
         </w:numPr>
       </w:pPr>
       <w:r>
-        <w:t>Productores propios</w:t>
+        <w:t>EXPORTAR SELECCIÓN exporta un archivo .xlsx con  los campos seleccionados.</w:t>
+      </w:r>
+    </w:p>
+    <w:p>
+      <w:r>
+        <w:rPr>
+          <w:b/>
+          <w:bCs/>
+        </w:rPr>
+        <w:t>EXPORTAR PDF</w:t>
+      </w:r>
+      <w:r>
+        <w:t xml:space="preserve">  Exporta en formato .pdf los archivos seleccionados</w:t>
+      </w:r>
+    </w:p>
+    <w:p>
+      <w:r>
+        <w:rPr>
+          <w:b/>
+          <w:bCs/>
+        </w:rPr>
+        <w:t xml:space="preserve">OPEN STREET MAP </w:t>
+      </w:r>
+      <w:r>
+        <w:t xml:space="preserve">entrando en esta </w:t>
+      </w:r>
+      <w:r>
+        <w:t>opción permita cambiar el fondo del mapa entre esta opción o la visión salelital de Google Earth</w:t>
+      </w:r>
+      <w:r>
+        <w:t>.</w:t>
+      </w:r>
+    </w:p>
+    <w:p/>
+    <w:p>
+      <w:r>
+        <w:t xml:space="preserve">Recordar que sólo se puede editar habiendo seleccionado el o los campos. </w:t>
+      </w:r>
+    </w:p>
+    <w:p/>
+    <w:p>
+      <w:r>
+        <w:t>MAppEAR se puede utilizar en PC/ TELÉFONOS CELULARES/ TABLETS y en caso de usar dispositivos móviles, haciendo click en el botón GPS localizado abajo a la izquierda en el mapa, localiza espacialmente al usuario. Para esto debe tener conexión a internet.</w:t>
+      </w:r>
+    </w:p>
+    <w:p/>
+    <w:p>
+      <w:r>
+        <w:t>UTILIDADES</w:t>
       </w:r>
     </w:p>
     <w:p>
@@ -547,10 +345,7 @@
         </w:numPr>
       </w:pPr>
       <w:r>
-        <w:t xml:space="preserve">Productores que compran a otros </w:t>
-      </w:r>
-      <w:r>
-        <w:t>BAYER</w:t>
+        <w:t>Productores propios</w:t>
       </w:r>
     </w:p>
     <w:p>
@@ -562,7 +357,8 @@
         </w:numPr>
       </w:pPr>
       <w:r>
-        <w:t>Productores que no nos compran</w:t>
+        <w:lastRenderedPageBreak/>
+        <w:t>Productores que compran a otros BAYER</w:t>
       </w:r>
     </w:p>
     <w:p>
@@ -574,7 +370,7 @@
         </w:numPr>
       </w:pPr>
       <w:r>
-        <w:t>Productores de cierto rango de has</w:t>
+        <w:t>Productores que no nos compran</w:t>
       </w:r>
     </w:p>
     <w:p>
@@ -586,7 +382,7 @@
         </w:numPr>
       </w:pPr>
       <w:r>
-        <w:t>Productores que no nos compran cierto producto</w:t>
+        <w:t>Productores de cierto rango de has</w:t>
       </w:r>
     </w:p>
     <w:p>
@@ -598,7 +394,7 @@
         </w:numPr>
       </w:pPr>
       <w:r>
-        <w:t>Productores objetivo para acción de MKT</w:t>
+        <w:t>Productores que no nos compran cierto producto</w:t>
       </w:r>
     </w:p>
     <w:p>
@@ -610,10 +406,7 @@
         </w:numPr>
       </w:pPr>
       <w:r>
-        <w:t>Campos en alquiler</w:t>
-      </w:r>
-      <w:r>
-        <w:t xml:space="preserve"> </w:t>
+        <w:t>Productores objetivo para acción de MKT</w:t>
       </w:r>
     </w:p>
     <w:p>
@@ -625,10 +418,7 @@
         </w:numPr>
       </w:pPr>
       <w:r>
-        <w:t>Campos con MANI</w:t>
-      </w:r>
-      <w:r>
-        <w:t xml:space="preserve"> / GIRASOL</w:t>
+        <w:t xml:space="preserve">Campos en alquiler </w:t>
       </w:r>
     </w:p>
     <w:p>
@@ -640,7 +430,7 @@
         </w:numPr>
       </w:pPr>
       <w:r>
-        <w:t>Campos siembra propia</w:t>
+        <w:t>Campos con MANI / GIRASOL</w:t>
       </w:r>
     </w:p>
     <w:p>
@@ -652,8 +442,7 @@
         </w:numPr>
       </w:pPr>
       <w:r>
-        <w:lastRenderedPageBreak/>
-        <w:t>Campos siembra competencia</w:t>
+        <w:t>Campos siembra propia</w:t>
       </w:r>
     </w:p>
     <w:p>
@@ -664,7 +453,11 @@
           <w:numId w:val="1"/>
         </w:numPr>
       </w:pPr>
-    </w:p>
+      <w:r>
+        <w:t>Campos siembra competencia</w:t>
+      </w:r>
+    </w:p>
+    <w:p/>
     <w:p/>
     <w:p/>
     <w:p/>

</xml_diff>